<commit_message>
Presupuesto ajustado a la Convocatoria 56 (seguros, posdoctorado, movilidad 2 %, 11 rubros del Anexo 3), cierre el 3 de noviembre y documentos regenerados
Co-Authored-By: Claude Sonnet 5.5 <noreply@anthropic.com>
Claude-Session: https://claude.ai/code/session_0173LeWkJaFDa3QiKWPAcEXZ
</commit_message>
<xml_diff>
--- a/genesis-e4-e3p00/PROYECTO_COMPLETO/DOCUMENTO/ANEXO2_DOCUMENTO_TECNICO_SGR_CONV56_AIRE.docx
+++ b/genesis-e4-e3p00/PROYECTO_COMPLETO/DOCUMENTO/ANEXO2_DOCUMENTO_TECNICO_SGR_CONV56_AIRE.docx
@@ -2802,7 +2802,7 @@
               <w:jc w:val="left"/>
             </w:pPr>
             <w:r>
-              <w:t xml:space="preserve">[DATO_USUARIO: confirmar 3 de noviembre de 2026 a las 4:00 p. m. (guía financiera) o 11 de noviembre de 2026 (ficha del proyecto)]</w:t>
+              <w:t xml:space="preserve">3 de noviembre de 2026, 4:00 p. m. (confirmado por el usuario; coincide con la guía financiera de la convocatoria)</w:t>
             </w:r>
           </w:p>
         </w:tc>
@@ -3320,7 +3320,7 @@
               <w:jc w:val="left"/>
             </w:pPr>
             <w:r>
-              <w:t xml:space="preserve">8: 6 jóvenes investigadores y 2 de maestría</w:t>
+              <w:t xml:space="preserve">9: 6 jóvenes investigadores, 2 de maestría y 1 doctor en estancia posdoctoral</w:t>
             </w:r>
           </w:p>
         </w:tc>
@@ -3484,7 +3484,7 @@
         <w:pStyle w:val="BodyText"/>
       </w:pPr>
       <w:r>
-        <w:t xml:space="preserve">Los resultados esperados son una red operativa con disponibilidad mensual de nodos de 90 % o más y un modelo de corrección validado. Se esperan también dos artículos científicos y un software registrado. Se espera además que 75 % o más de 15 comités use el tablero en decisiones documentadas y que 60 personas queden certificadas. El proyecto no afirma efectos en la salud. Solicita $ 9.267.260.000 al SGR y suma una contrapartida de $ 2.110.000.000.</w:t>
+        <w:t xml:space="preserve">Los resultados esperados son una red operativa con disponibilidad mensual de nodos de 90 % o más y un modelo de corrección validado. Se esperan también dos artículos científicos y un software registrado. Se espera además que 75 % o más de 15 comités use el tablero en decisiones documentadas y que 60 personas queden certificadas. El proyecto no afirma efectos en la salud. Solicita $ 8.729.840.000 al SGR y suma una contrapartida de $ 2.110.000.000.</w:t>
       </w:r>
     </w:p>
     <w:bookmarkEnd w:id="23"/>
@@ -5893,7 +5893,7 @@
               <w:jc w:val="left"/>
             </w:pPr>
             <w:r>
-              <w:t xml:space="preserve">Financiar el proyecto con $ 9.267.260.000 de la Asignación de CTeI del SGR</w:t>
+              <w:t xml:space="preserve">Financiar el proyecto con $ 8.729.840.000 de la Asignación de CTeI del SGR</w:t>
             </w:r>
           </w:p>
         </w:tc>
@@ -10494,7 +10494,7 @@
         <w:pStyle w:val="FirstParagraph"/>
       </w:pPr>
       <w:r>
-        <w:t xml:space="preserve">La Tabla D.17 relaciona cada objetivo con sus productos, el medio de verificación, la meta y las actividades. Las actividades de administración y apoyo a la supervisión aparecen en cada objetivo. La Tabla D.18 valora cada actividad con la asignación de las 56 líneas del presupuesto SGR, de modo que la suma coincide con el total solicitado.</w:t>
+        <w:t xml:space="preserve">La Tabla D.17 relaciona cada objetivo con sus productos, el medio de verificación, la meta y las actividades. Las actividades de administración y apoyo a la supervisión aparecen en cada objetivo. La Tabla D.18 valora cada actividad con la asignación de las 54 líneas del presupuesto SGR, de modo que la suma coincide con el total solicitado.</w:t>
       </w:r>
     </w:p>
     <w:p>
@@ -11417,7 +11417,7 @@
               <w:jc w:val="left"/>
             </w:pPr>
             <w:r>
-              <w:t xml:space="preserve">$ 216.666.668</w:t>
+              <w:t xml:space="preserve">$ 106.666.668</w:t>
             </w:r>
           </w:p>
         </w:tc>
@@ -11478,7 +11478,7 @@
               <w:jc w:val="left"/>
             </w:pPr>
             <w:r>
-              <w:t xml:space="preserve">$ 111.120.000</w:t>
+              <w:t xml:space="preserve">$ 99.792.000</w:t>
             </w:r>
           </w:p>
         </w:tc>
@@ -11531,7 +11531,7 @@
               <w:jc w:val="left"/>
             </w:pPr>
             <w:r>
-              <w:t xml:space="preserve">$ 995.800.000</w:t>
+              <w:t xml:space="preserve">$ 967.480.000</w:t>
             </w:r>
           </w:p>
         </w:tc>
@@ -11592,7 +11592,7 @@
               <w:jc w:val="left"/>
             </w:pPr>
             <w:r>
-              <w:t xml:space="preserve">$ 623.763.793</w:t>
+              <w:t xml:space="preserve">$ 480.251.793</w:t>
             </w:r>
           </w:p>
         </w:tc>
@@ -11645,7 +11645,7 @@
               <w:jc w:val="left"/>
             </w:pPr>
             <w:r>
-              <w:t xml:space="preserve">$ 212.240.000</w:t>
+              <w:t xml:space="preserve">$ 189.584.000</w:t>
             </w:r>
           </w:p>
         </w:tc>
@@ -11759,7 +11759,7 @@
               <w:jc w:val="left"/>
             </w:pPr>
             <w:r>
-              <w:t xml:space="preserve">$ 143.848.419</w:t>
+              <w:t xml:space="preserve">$ 126.856.419</w:t>
             </w:r>
           </w:p>
         </w:tc>
@@ -11820,7 +11820,7 @@
               <w:jc w:val="left"/>
             </w:pPr>
             <w:r>
-              <w:t xml:space="preserve">$ 522.595.788</w:t>
+              <w:t xml:space="preserve">$ 465.283.788</w:t>
             </w:r>
           </w:p>
         </w:tc>
@@ -11930,7 +11930,7 @@
               <w:jc w:val="left"/>
             </w:pPr>
             <w:r>
-              <w:t xml:space="preserve">$ 3.290.701.334</w:t>
+              <w:t xml:space="preserve">$ 2.900.581.334</w:t>
             </w:r>
           </w:p>
         </w:tc>
@@ -12097,7 +12097,7 @@
               <w:jc w:val="left"/>
             </w:pPr>
             <w:r>
-              <w:t xml:space="preserve">$ 1.412.424.000</w:t>
+              <w:t xml:space="preserve">$ 1.338.774.000</w:t>
             </w:r>
           </w:p>
         </w:tc>
@@ -12211,7 +12211,7 @@
               <w:jc w:val="left"/>
             </w:pPr>
             <w:r>
-              <w:t xml:space="preserve">$ 1.266.768.000</w:t>
+              <w:t xml:space="preserve">$ 1.193.118.000</w:t>
             </w:r>
           </w:p>
         </w:tc>
@@ -12321,7 +12321,7 @@
               <w:jc w:val="left"/>
             </w:pPr>
             <w:r>
-              <w:t xml:space="preserve">$ 4.312.058.666</w:t>
+              <w:t xml:space="preserve">$ 4.164.758.666</w:t>
             </w:r>
           </w:p>
         </w:tc>
@@ -12716,7 +12716,7 @@
               <w:jc w:val="left"/>
             </w:pPr>
             <w:r>
-              <w:t xml:space="preserve">$ 9.267.260.000</w:t>
+              <w:t xml:space="preserve">$ 8.729.840.000</w:t>
             </w:r>
           </w:p>
         </w:tc>
@@ -12737,7 +12737,7 @@
         <w:t xml:space="preserve"> </w:t>
       </w:r>
       <w:r>
-        <w:t xml:space="preserve">Elaboración propia con las 56 líneas del presupuesto SGR. Regla de asignación PROPUESTA: el personal se reparte según la duración de las actividades de su paquete; los equipos y servicios se asignan a la actividad que los usa; la reserva de contingencia (636 millones de COP) se asigna por mitades a las compuertas C1 y C2, que la liberan; la administración (360 millones de COP) se divide en tres partes iguales.</w:t>
+        <w:t xml:space="preserve">Elaboración propia con las 54 líneas del presupuesto SGR. Regla de asignación PROPUESTA: el personal se reparte según la duración de las actividades de su paquete; los equipos y servicios se asignan a la actividad que los usa; la reserva de contingencia (636 millones de COP) se asigna por mitades a las compuertas C1 y C2, que la liberan; la administración (360 millones de COP) se divide en tres partes iguales.</w:t>
       </w:r>
     </w:p>
     <w:p>
@@ -12745,7 +12745,7 @@
         <w:pStyle w:val="BodyText"/>
       </w:pPr>
       <w:r>
-        <w:t xml:space="preserve">La administración y el apoyo a la supervisión suman $ 360.000.000, equivalentes a 3,9 % del valor SGR. El tope porcentual de esta categoría no se verificó (NO_VERIFICADO). Los miembros de la alianza participan en actividades presupuestadas según el presupuesto por actor del expediente.</w:t>
+        <w:t xml:space="preserve">La administración y el apoyo a la supervisión suman $ 360.000.000, equivalentes a 4,1 % del valor SGR. El tope porcentual de esta categoría no se verificó (NO_VERIFICADO). Los miembros de la alianza participan en actividades presupuestadas según el presupuesto por actor del expediente.</w:t>
       </w:r>
     </w:p>
     <w:p>
@@ -12753,7 +12753,7 @@
         <w:pStyle w:val="BodyText"/>
       </w:pPr>
       <w:r>
-        <w:t xml:space="preserve">Los valores de esta sección corresponden al presupuesto original. La verificación presupuestal identifica ajustes pendientes: seguros, movilidad, posdoctorado y contrapartida del actor reconocido. Los valores se actualizan cuando la alianza decida.</w:t>
+        <w:t xml:space="preserve">Los valores incorporan los ajustes de la verificación presupuestal. Se retiraron los seguros, se incluyó el posdoctorado y la movilidad se limitó al 2 % del valor SGR. Quedan pendientes las cotizaciones y la contrapartida del actor reconocido.</w:t>
       </w:r>
     </w:p>
     <w:bookmarkEnd w:id="54"/>
@@ -12771,7 +12771,7 @@
         <w:pStyle w:val="FirstParagraph"/>
       </w:pPr>
       <w:r>
-        <w:t xml:space="preserve">El proyecto contribuye a los Objetivos de Desarrollo Sostenible 11, 9, 17 y 3, este último de forma indirecta (Organización de las Naciones Unidas [ONU], 2015). Se alinea con el Plan Nacional de Desarrollo en gestión del riesgo y acción climática (Congreso de la República, 2023). Fortalece la capacidad de generación de conocimiento con dos artículos, un laboratorio de calibración y la formación de ocho personas en investigación.</w:t>
+        <w:t xml:space="preserve">El proyecto contribuye a los Objetivos de Desarrollo Sostenible 11, 9, 17 y 3, este último de forma indirecta (Organización de las Naciones Unidas [ONU], 2015). Se alinea con el Plan Nacional de Desarrollo en gestión del riesgo y acción climática (Congreso de la República, 2023). Fortalece la capacidad de generación de conocimiento con dos artículos, un laboratorio de calibración y la formación de nueve personas en investigación.</w:t>
       </w:r>
     </w:p>
     <w:p>
@@ -14687,7 +14687,7 @@
         <w:pStyle w:val="FirstParagraph"/>
       </w:pPr>
       <w:r>
-        <w:t xml:space="preserve">La Tabla D.23 presenta las tres actividades del plan con su presupuesto. Suman $ 378.000.000, equivalentes a 4,08 % del valor SGR y a 3,32 % del valor total. El mínimo de 1 % del valor total es $ 113.772.600. El proyecto lo supera. Las publicaciones y los talleres de apropiación social no se cuentan.</w:t>
+        <w:t xml:space="preserve">La Tabla D.23 presenta las tres actividades del plan con su presupuesto. Suman $ 378.000.000, equivalentes a 4,33 % del valor SGR y a 3,49 % del valor total. El mínimo de 1 % del valor total es $ 108.398.400. El proyecto lo supera. Las publicaciones y los talleres de apropiación social no se cuentan.</w:t>
       </w:r>
     </w:p>
     <w:p>
@@ -15659,7 +15659,7 @@
         <w:pStyle w:val="BodyText"/>
       </w:pPr>
       <w:r>
-        <w:t xml:space="preserve">El presupuesto de apropiación social suma $ 726.500.000, equivalentes a 7,8 % del valor SGR. Incluye la coordinación y los profesionales sociales. Incluye también cartillas, kits de talleres y elementos de protección personal. Incluye la logística de ferias y las publicaciones de divulgación (líneas P05, P11, M04, M05, M06, V05, O02 y O06).</w:t>
+        <w:t xml:space="preserve">El presupuesto de apropiación social suma $ 726.500.000, equivalentes a 8,3 % del valor SGR. Incluye la coordinación y los profesionales sociales. Incluye también cartillas, kits de talleres y elementos de protección personal. Incluye la logística de ferias y las publicaciones de divulgación (líneas P05, P11, M04, M05, M06, V05, O02 y O06).</w:t>
       </w:r>
     </w:p>
     <w:bookmarkEnd w:id="64"/>
@@ -23736,7 +23736,7 @@
               <w:jc w:val="left"/>
             </w:pPr>
             <w:r>
-              <w:t xml:space="preserve">Póliza todo riesgo, cerramientos y custodia local por sitio.</w:t>
+              <w:t xml:space="preserve">Cerramientos, custodia local por sitio y seguro de equipos de la entidad ejecutora, fuera del presupuesto SGR.</w:t>
             </w:r>
           </w:p>
         </w:tc>
@@ -25770,7 +25770,7 @@
               <w:jc w:val="left"/>
             </w:pPr>
             <w:r>
-              <w:t xml:space="preserve">Investigador principal (50 %), coinvestigadores y científico de datos senior</w:t>
+              <w:t xml:space="preserve">Investigador principal (50 %), coinvestigadores y doctor en estancia posdoctoral</w:t>
             </w:r>
           </w:p>
         </w:tc>
@@ -27084,7 +27084,7 @@
               <w:jc w:val="left"/>
             </w:pPr>
             <w:r>
-              <w:t xml:space="preserve">$ 9.267.260.000</w:t>
+              <w:t xml:space="preserve">$ 8.729.840.000</w:t>
             </w:r>
           </w:p>
         </w:tc>
@@ -27256,7 +27256,7 @@
               <w:jc w:val="left"/>
             </w:pPr>
             <w:r>
-              <w:t xml:space="preserve">$ 11.377.260.000</w:t>
+              <w:t xml:space="preserve">$ 10.839.840.000</w:t>
             </w:r>
           </w:p>
         </w:tc>
@@ -27285,7 +27285,7 @@
         <w:pStyle w:val="BodyText"/>
       </w:pPr>
       <w:r>
-        <w:t xml:space="preserve">Los valores corresponden al presupuesto original. Los ajustes pendientes de la verificación presupuestal modificarían el valor SGR y la contrapartida. La alianza debe decidirlos antes de radicar.</w:t>
+        <w:t xml:space="preserve">Los valores incorporan los ajustes de la verificación presupuestal. La contrapartida del actor reconocido queda en blanco hasta que la alianza la defina.</w:t>
       </w:r>
     </w:p>
     <w:p>
@@ -27303,7 +27303,7 @@
         <w:t xml:space="preserve"> </w:t>
       </w:r>
       <w:r>
-        <w:t xml:space="preserve">nueve mil doscientos sesenta y siete millones doscientos sesenta mil pesos ($ 9.267.260.000).</w:t>
+        <w:t xml:space="preserve">ocho mil setecientos veintinueve millones ochocientos cuarenta mil pesos ($ 8.729.840.000).</w:t>
       </w:r>
     </w:p>
     <w:p>
@@ -27339,7 +27339,7 @@
         <w:t xml:space="preserve"> </w:t>
       </w:r>
       <w:r>
-        <w:t xml:space="preserve">once mil trescientos setenta y siete millones doscientos sesenta mil pesos ($ 11.377.260.000).</w:t>
+        <w:t xml:space="preserve">diez mil ochocientos treinta y nueve millones ochocientos cuarenta mil pesos ($ 10.839.840.000).</w:t>
       </w:r>
     </w:p>
     <w:bookmarkEnd w:id="74"/>

</xml_diff>